<commit_message>
Fix DOCX oracle JSON escaping and ASCII fixture text.
Keep inspectJson UTF-8 safe, scrub non-ASCII from fixture generator
text, and harden semantic.json loading so oracles stay green.

Co-authored-by: Tero <terotests@users.noreply.github.com>
</commit_message>
<xml_diff>
--- a/gallery/docx_viewer/fixtures/05-table-basic.docx
+++ b/gallery/docx_viewer/fixtures/05-table-basic.docx
@@ -15,7 +15,7 @@
     </w:p>
     <w:p>
       <w:r>
-        <w:t xml:space="preserve">A simple 3×3 table with a header row.</w:t>
+        <w:t xml:space="preserve">A simple 3x3 table with a header row.</w:t>
       </w:r>
     </w:p>
     <w:tbl>
@@ -151,7 +151,7 @@
     <w:lvl w:ilvl="0">
       <w:start w:val="1"/>
       <w:numFmt w:val="bullet"/>
-      <w:lvlText w:val="•"/>
+      <w:lvlText w:val="-"/>
       <w:pPr>
         <w:ind w:left="720" w:hanging="360"/>
       </w:pPr>
@@ -159,7 +159,7 @@
     <w:lvl w:ilvl="1">
       <w:start w:val="1"/>
       <w:numFmt w:val="bullet"/>
-      <w:lvlText w:val="○"/>
+      <w:lvlText w:val="-"/>
       <w:pPr>
         <w:ind w:left="1440" w:hanging="360"/>
       </w:pPr>

</xml_diff>